<commit_message>
Arreglo Campos Datos Personales
</commit_message>
<xml_diff>
--- a/webapp/pdf/Beneficios_Extralegales.docx
+++ b/webapp/pdf/Beneficios_Extralegales.docx
@@ -1,6 +1,6 @@
 
 <file path=word/document.xml><?xml version="1.0" encoding="utf-8"?>
-<w:document xmlns:wpc="http://schemas.microsoft.com/office/word/2010/wordprocessingCanvas" xmlns:cx="http://schemas.microsoft.com/office/drawing/2014/chartex" xmlns:cx1="http://schemas.microsoft.com/office/drawing/2015/9/8/chartex" xmlns:cx2="http://schemas.microsoft.com/office/drawing/2015/10/21/chartex" xmlns:cx3="http://schemas.microsoft.com/office/drawing/2016/5/9/chartex" xmlns:cx4="http://schemas.microsoft.com/office/drawing/2016/5/10/chartex" xmlns:cx5="http://schemas.microsoft.com/office/drawing/2016/5/11/chartex" xmlns:cx6="http://schemas.microsoft.com/office/drawing/2016/5/12/chartex" xmlns:cx7="http://schemas.microsoft.com/office/drawing/2016/5/13/chartex" xmlns:cx8="http://schemas.microsoft.com/office/drawing/2016/5/14/chartex" xmlns:mc="http://schemas.openxmlformats.org/markup-compatibility/2006" xmlns:aink="http://schemas.microsoft.com/office/drawing/2016/ink" xmlns:am3d="http://schemas.microsoft.com/office/drawing/2017/model3d" xmlns:o="urn:schemas-microsoft-com:office:office" xmlns:oel="http://schemas.microsoft.com/office/2019/extlst" xmlns:r="http://schemas.openxmlformats.org/officeDocument/2006/relationships" xmlns:m="http://schemas.openxmlformats.org/officeDocument/2006/math" xmlns:v="urn:schemas-microsoft-com:vml" xmlns:wp14="http://schemas.microsoft.com/office/word/2010/wordprocessingDrawing" xmlns:wp="http://schemas.openxmlformats.org/drawingml/2006/wordprocessingDrawing" xmlns:w10="urn:schemas-microsoft-com:office:word" xmlns:w="http://schemas.openxmlformats.org/wordprocessingml/2006/main" xmlns:w14="http://schemas.microsoft.com/office/word/2010/wordml" xmlns:w15="http://schemas.microsoft.com/office/word/2012/wordml" xmlns:w16cex="http://schemas.microsoft.com/office/word/2018/wordml/cex" xmlns:w16cid="http://schemas.microsoft.com/office/word/2016/wordml/cid" xmlns:w16="http://schemas.microsoft.com/office/word/2018/wordml" xmlns:w16du="http://schemas.microsoft.com/office/word/2023/wordml/word16du" xmlns:w16sdtdh="http://schemas.microsoft.com/office/word/2020/wordml/sdtdatahash" xmlns:w16se="http://schemas.microsoft.com/office/word/2015/wordml/symex" xmlns:wpg="http://schemas.microsoft.com/office/word/2010/wordprocessingGroup" xmlns:wpi="http://schemas.microsoft.com/office/word/2010/wordprocessingInk" xmlns:wne="http://schemas.microsoft.com/office/word/2006/wordml" xmlns:wps="http://schemas.microsoft.com/office/word/2010/wordprocessingShape" mc:Ignorable="w14 w15 w16se w16cid w16 w16cex w16sdtdh w16du wp14">
+<w:document xmlns:wpc="http://schemas.microsoft.com/office/word/2010/wordprocessingCanvas" xmlns:cx="http://schemas.microsoft.com/office/drawing/2014/chartex" xmlns:cx1="http://schemas.microsoft.com/office/drawing/2015/9/8/chartex" xmlns:cx2="http://schemas.microsoft.com/office/drawing/2015/10/21/chartex" xmlns:cx3="http://schemas.microsoft.com/office/drawing/2016/5/9/chartex" xmlns:cx4="http://schemas.microsoft.com/office/drawing/2016/5/10/chartex" xmlns:cx5="http://schemas.microsoft.com/office/drawing/2016/5/11/chartex" xmlns:cx6="http://schemas.microsoft.com/office/drawing/2016/5/12/chartex" xmlns:cx7="http://schemas.microsoft.com/office/drawing/2016/5/13/chartex" xmlns:cx8="http://schemas.microsoft.com/office/drawing/2016/5/14/chartex" xmlns:mc="http://schemas.openxmlformats.org/markup-compatibility/2006" xmlns:aink="http://schemas.microsoft.com/office/drawing/2016/ink" xmlns:am3d="http://schemas.microsoft.com/office/drawing/2017/model3d" xmlns:o="urn:schemas-microsoft-com:office:office" xmlns:r="http://schemas.openxmlformats.org/officeDocument/2006/relationships" xmlns:m="http://schemas.openxmlformats.org/officeDocument/2006/math" xmlns:v="urn:schemas-microsoft-com:vml" xmlns:wp14="http://schemas.microsoft.com/office/word/2010/wordprocessingDrawing" xmlns:wp="http://schemas.openxmlformats.org/drawingml/2006/wordprocessingDrawing" xmlns:w10="urn:schemas-microsoft-com:office:word" xmlns:w="http://schemas.openxmlformats.org/wordprocessingml/2006/main" xmlns:w14="http://schemas.microsoft.com/office/word/2010/wordml" xmlns:w15="http://schemas.microsoft.com/office/word/2012/wordml" xmlns:w16cex="http://schemas.microsoft.com/office/word/2018/wordml/cex" xmlns:w16cid="http://schemas.microsoft.com/office/word/2016/wordml/cid" xmlns:w16="http://schemas.microsoft.com/office/word/2018/wordml" xmlns:w16sdtdh="http://schemas.microsoft.com/office/word/2020/wordml/sdtdatahash" xmlns:w16se="http://schemas.microsoft.com/office/word/2015/wordml/symex" xmlns:wpg="http://schemas.microsoft.com/office/word/2010/wordprocessingGroup" xmlns:wpi="http://schemas.microsoft.com/office/word/2010/wordprocessingInk" xmlns:wne="http://schemas.microsoft.com/office/word/2006/wordml" xmlns:wps="http://schemas.microsoft.com/office/word/2010/wordprocessingShape" mc:Ignorable="w14 w15 w16se w16cid w16 w16cex w16sdtdh wp14">
   <w:body>
     <w:p>
       <w:pPr>
@@ -101,156 +101,122 @@
           <w:tab w:val="left" w:pos="5209"/>
         </w:tabs>
         <w:ind w:left="197" w:right="97"/>
-        <w:rPr>
-          <w:rFonts w:asciiTheme="minorHAnsi" w:hAnsiTheme="minorHAnsi" w:cstheme="minorHAnsi"/>
-        </w:rPr>
-      </w:pPr>
-      <w:r>
-        <w:rPr>
-          <w:rFonts w:asciiTheme="minorHAnsi" w:hAnsiTheme="minorHAnsi" w:cstheme="minorHAnsi"/>
-        </w:rPr>
+      </w:pPr>
+      <w:r>
         <w:t>El</w:t>
       </w:r>
       <w:r>
         <w:rPr>
-          <w:rFonts w:asciiTheme="minorHAnsi" w:hAnsiTheme="minorHAnsi" w:cstheme="minorHAnsi"/>
           <w:spacing w:val="40"/>
         </w:rPr>
         <w:t xml:space="preserve"> </w:t>
       </w:r>
       <w:r>
-        <w:rPr>
-          <w:rFonts w:asciiTheme="minorHAnsi" w:hAnsiTheme="minorHAnsi" w:cstheme="minorHAnsi"/>
-        </w:rPr>
-        <w:t>suscrito</w:t>
-      </w:r>
-      <w:r>
-        <w:rPr>
-          <w:rFonts w:asciiTheme="minorHAnsi" w:hAnsiTheme="minorHAnsi" w:cstheme="minorHAnsi"/>
-        </w:rPr>
-        <w:t>, [[Nombre]]</w:t>
-      </w:r>
-      <w:r>
-        <w:rPr>
-          <w:rFonts w:asciiTheme="minorHAnsi" w:hAnsiTheme="minorHAnsi" w:cstheme="minorHAnsi"/>
-        </w:rPr>
-        <w:t>,</w:t>
-      </w:r>
-      <w:r>
-        <w:rPr>
-          <w:rFonts w:asciiTheme="minorHAnsi" w:hAnsiTheme="minorHAnsi" w:cstheme="minorHAnsi"/>
+        <w:t>suscrito,</w:t>
+      </w:r>
+      <w:r>
+        <w:rPr>
+          <w:spacing w:val="34"/>
+        </w:rPr>
+        <w:t xml:space="preserve"> </w:t>
+      </w:r>
+      <w:r>
+        <w:t>[[Nombre]],</w:t>
+      </w:r>
+      <w:r>
+        <w:rPr>
           <w:spacing w:val="36"/>
         </w:rPr>
         <w:t xml:space="preserve"> </w:t>
       </w:r>
       <w:r>
-        <w:rPr>
-          <w:rFonts w:asciiTheme="minorHAnsi" w:hAnsiTheme="minorHAnsi" w:cstheme="minorHAnsi"/>
-        </w:rPr>
-        <w:t xml:space="preserve">[[Identificado]] </w:t>
-      </w:r>
-      <w:r>
-        <w:rPr>
-          <w:rFonts w:asciiTheme="minorHAnsi" w:hAnsiTheme="minorHAnsi" w:cstheme="minorHAnsi"/>
-        </w:rPr>
+        <w:t>identificado</w:t>
+      </w:r>
+      <w:r>
+        <w:rPr>
+          <w:spacing w:val="30"/>
+        </w:rPr>
+        <w:t xml:space="preserve"> </w:t>
+      </w:r>
+      <w:r>
         <w:t>como</w:t>
       </w:r>
       <w:r>
         <w:rPr>
-          <w:rFonts w:asciiTheme="minorHAnsi" w:hAnsiTheme="minorHAnsi" w:cstheme="minorHAnsi"/>
           <w:spacing w:val="30"/>
         </w:rPr>
         <w:t xml:space="preserve"> </w:t>
       </w:r>
       <w:r>
         <w:rPr>
-          <w:rFonts w:asciiTheme="minorHAnsi" w:hAnsiTheme="minorHAnsi" w:cstheme="minorHAnsi"/>
           <w:spacing w:val="30"/>
         </w:rPr>
-        <w:t xml:space="preserve">[[Cedula]] </w:t>
-      </w:r>
-      <w:r>
-        <w:rPr>
-          <w:rFonts w:asciiTheme="minorHAnsi" w:hAnsiTheme="minorHAnsi" w:cstheme="minorHAnsi"/>
+        <w:t>[[Cedula]]</w:t>
+      </w:r>
+      <w:r>
+        <w:rPr>
+          <w:spacing w:val="30"/>
+        </w:rPr>
+        <w:t xml:space="preserve"> </w:t>
+      </w:r>
+      <w:r>
+        <w:rPr>
+          <w:spacing w:val="30"/>
         </w:rPr>
         <w:t>aparece</w:t>
       </w:r>
       <w:r>
         <w:rPr>
-          <w:rFonts w:asciiTheme="minorHAnsi" w:hAnsiTheme="minorHAnsi" w:cstheme="minorHAnsi"/>
           <w:spacing w:val="31"/>
         </w:rPr>
         <w:t xml:space="preserve"> </w:t>
       </w:r>
       <w:r>
-        <w:rPr>
-          <w:rFonts w:asciiTheme="minorHAnsi" w:hAnsiTheme="minorHAnsi" w:cstheme="minorHAnsi"/>
-        </w:rPr>
         <w:t>al</w:t>
       </w:r>
       <w:r>
         <w:rPr>
-          <w:rFonts w:asciiTheme="minorHAnsi" w:hAnsiTheme="minorHAnsi" w:cstheme="minorHAnsi"/>
           <w:spacing w:val="31"/>
         </w:rPr>
         <w:t xml:space="preserve"> </w:t>
       </w:r>
       <w:r>
-        <w:rPr>
-          <w:rFonts w:asciiTheme="minorHAnsi" w:hAnsiTheme="minorHAnsi" w:cstheme="minorHAnsi"/>
-        </w:rPr>
         <w:t>pie</w:t>
       </w:r>
       <w:r>
         <w:rPr>
-          <w:rFonts w:asciiTheme="minorHAnsi" w:hAnsiTheme="minorHAnsi" w:cstheme="minorHAnsi"/>
           <w:spacing w:val="31"/>
         </w:rPr>
         <w:t xml:space="preserve"> </w:t>
       </w:r>
       <w:r>
-        <w:rPr>
-          <w:rFonts w:asciiTheme="minorHAnsi" w:hAnsiTheme="minorHAnsi" w:cstheme="minorHAnsi"/>
-        </w:rPr>
         <w:t>de</w:t>
       </w:r>
       <w:r>
         <w:rPr>
-          <w:rFonts w:asciiTheme="minorHAnsi" w:hAnsiTheme="minorHAnsi" w:cstheme="minorHAnsi"/>
           <w:spacing w:val="29"/>
         </w:rPr>
         <w:t xml:space="preserve"> </w:t>
       </w:r>
       <w:r>
-        <w:rPr>
-          <w:rFonts w:asciiTheme="minorHAnsi" w:hAnsiTheme="minorHAnsi" w:cstheme="minorHAnsi"/>
-        </w:rPr>
         <w:t>mi</w:t>
       </w:r>
       <w:r>
         <w:rPr>
-          <w:rFonts w:asciiTheme="minorHAnsi" w:hAnsiTheme="minorHAnsi" w:cstheme="minorHAnsi"/>
           <w:spacing w:val="30"/>
         </w:rPr>
         <w:t xml:space="preserve"> </w:t>
       </w:r>
       <w:r>
-        <w:rPr>
-          <w:rFonts w:asciiTheme="minorHAnsi" w:hAnsiTheme="minorHAnsi" w:cstheme="minorHAnsi"/>
-        </w:rPr>
         <w:t>firma,</w:t>
       </w:r>
       <w:r>
         <w:rPr>
-          <w:rFonts w:asciiTheme="minorHAnsi" w:hAnsiTheme="minorHAnsi" w:cstheme="minorHAnsi"/>
           <w:spacing w:val="31"/>
         </w:rPr>
         <w:t xml:space="preserve"> </w:t>
       </w:r>
       <w:r>
-        <w:rPr>
-          <w:rFonts w:asciiTheme="minorHAnsi" w:hAnsiTheme="minorHAnsi" w:cstheme="minorHAnsi"/>
-        </w:rPr>
         <w:t>por medio del presente escrito me permito manifestar lo siguiente:</w:t>
       </w:r>
     </w:p>
@@ -269,10 +235,7 @@
         <w:jc w:val="both"/>
       </w:pPr>
       <w:r>
-        <w:t xml:space="preserve">Que es de mi conocimiento que </w:t>
-      </w:r>
-      <w:r>
-        <w:t>DIACO S.A., ha implementado un Plan de Beneficios Extralegales, que busca garantizar al bienestar y mejoramiento del nivel de vida de sus trabajadores.</w:t>
+        <w:t>Que es de mi conocimiento que DIACO S.A., ha implementado un Plan de Beneficios Extralegales, que busca garantizar al bienestar y mejoramiento del nivel de vida de sus trabajadores.</w:t>
       </w:r>
     </w:p>
     <w:p>
@@ -1210,10 +1173,7 @@
         <w:jc w:val="both"/>
       </w:pPr>
       <w:r>
-        <w:t xml:space="preserve">Ahora bien, en </w:t>
-      </w:r>
-      <w:r>
-        <w:t>el caso que en mi calidad de trabajador me convierta en beneficiario de una fuente de beneficios colectivos distinta al plan ofrecido por la empresa o renuncie expresamente al mismo, para acceder a otro, automáticamente dejará de aplicar el Plan de Beneficios Extralegales que hoy en día accedo, en tanto que no es viable que coexistan dos fuentes sobre un mismo trabajador.</w:t>
+        <w:t>Ahora bien, en el caso que en mi calidad de trabajador me convierta en beneficiario de una fuente de beneficios colectivos distinta al plan ofrecido por la empresa o renuncie expresamente al mismo, para acceder a otro, automáticamente dejará de aplicar el Plan de Beneficios Extralegales que hoy en día accedo, en tanto que no es viable que coexistan dos fuentes sobre un mismo trabajador.</w:t>
       </w:r>
     </w:p>
     <w:p>
@@ -1399,22 +1359,13 @@
       <w:pPr>
         <w:pStyle w:val="Textoindependiente"/>
         <w:spacing w:before="25"/>
+        <w:ind w:firstLine="197"/>
         <w:rPr>
           <w:sz w:val="20"/>
         </w:rPr>
       </w:pPr>
       <w:r>
-        <w:rPr>
-          <w:noProof/>
-          <w:sz w:val="20"/>
-        </w:rPr>
-        <w:t xml:space="preserve">     </w:t>
-      </w:r>
-      <w:r>
-        <w:rPr>
-          <w:rFonts w:asciiTheme="minorHAnsi" w:hAnsiTheme="minorHAnsi" w:cstheme="minorHAnsi"/>
-        </w:rPr>
-        <w:t>[[Nombre]]</w:t>
+        <w:t>[[Nombre]],</w:t>
       </w:r>
     </w:p>
     <w:p>
@@ -1456,14 +1407,12 @@
       </w:r>
       <w:r>
         <w:rPr>
-          <w:rFonts w:asciiTheme="minorHAnsi" w:hAnsiTheme="minorHAnsi" w:cstheme="minorHAnsi"/>
           <w:spacing w:val="30"/>
         </w:rPr>
         <w:t>[[Cedula]]</w:t>
       </w:r>
       <w:r>
         <w:rPr>
-          <w:rFonts w:asciiTheme="minorHAnsi" w:hAnsiTheme="minorHAnsi" w:cstheme="minorHAnsi"/>
           <w:spacing w:val="30"/>
         </w:rPr>
         <w:t xml:space="preserve"> </w:t>
@@ -1615,12 +1564,12 @@
 </file>
 
 <file path=word/numbering.xml><?xml version="1.0" encoding="utf-8"?>
-<w:numbering xmlns:wpc="http://schemas.microsoft.com/office/word/2010/wordprocessingCanvas" xmlns:cx="http://schemas.microsoft.com/office/drawing/2014/chartex" xmlns:cx1="http://schemas.microsoft.com/office/drawing/2015/9/8/chartex" xmlns:cx2="http://schemas.microsoft.com/office/drawing/2015/10/21/chartex" xmlns:cx3="http://schemas.microsoft.com/office/drawing/2016/5/9/chartex" xmlns:cx4="http://schemas.microsoft.com/office/drawing/2016/5/10/chartex" xmlns:cx5="http://schemas.microsoft.com/office/drawing/2016/5/11/chartex" xmlns:cx6="http://schemas.microsoft.com/office/drawing/2016/5/12/chartex" xmlns:cx7="http://schemas.microsoft.com/office/drawing/2016/5/13/chartex" xmlns:cx8="http://schemas.microsoft.com/office/drawing/2016/5/14/chartex" xmlns:mc="http://schemas.openxmlformats.org/markup-compatibility/2006" xmlns:aink="http://schemas.microsoft.com/office/drawing/2016/ink" xmlns:am3d="http://schemas.microsoft.com/office/drawing/2017/model3d" xmlns:o="urn:schemas-microsoft-com:office:office" xmlns:oel="http://schemas.microsoft.com/office/2019/extlst" xmlns:r="http://schemas.openxmlformats.org/officeDocument/2006/relationships" xmlns:m="http://schemas.openxmlformats.org/officeDocument/2006/math" xmlns:v="urn:schemas-microsoft-com:vml" xmlns:wp14="http://schemas.microsoft.com/office/word/2010/wordprocessingDrawing" xmlns:wp="http://schemas.openxmlformats.org/drawingml/2006/wordprocessingDrawing" xmlns:w10="urn:schemas-microsoft-com:office:word" xmlns:w="http://schemas.openxmlformats.org/wordprocessingml/2006/main" xmlns:w14="http://schemas.microsoft.com/office/word/2010/wordml" xmlns:w15="http://schemas.microsoft.com/office/word/2012/wordml" xmlns:w16cex="http://schemas.microsoft.com/office/word/2018/wordml/cex" xmlns:w16cid="http://schemas.microsoft.com/office/word/2016/wordml/cid" xmlns:w16="http://schemas.microsoft.com/office/word/2018/wordml" xmlns:w16du="http://schemas.microsoft.com/office/word/2023/wordml/word16du" xmlns:w16sdtdh="http://schemas.microsoft.com/office/word/2020/wordml/sdtdatahash" xmlns:w16se="http://schemas.microsoft.com/office/word/2015/wordml/symex" xmlns:wpg="http://schemas.microsoft.com/office/word/2010/wordprocessingGroup" xmlns:wpi="http://schemas.microsoft.com/office/word/2010/wordprocessingInk" xmlns:wne="http://schemas.microsoft.com/office/word/2006/wordml" xmlns:wps="http://schemas.microsoft.com/office/word/2010/wordprocessingShape" mc:Ignorable="w14 w15 w16se w16cid w16 w16cex w16sdtdh w16du wp14">
+<w:numbering xmlns:wpc="http://schemas.microsoft.com/office/word/2010/wordprocessingCanvas" xmlns:cx="http://schemas.microsoft.com/office/drawing/2014/chartex" xmlns:cx1="http://schemas.microsoft.com/office/drawing/2015/9/8/chartex" xmlns:cx2="http://schemas.microsoft.com/office/drawing/2015/10/21/chartex" xmlns:cx3="http://schemas.microsoft.com/office/drawing/2016/5/9/chartex" xmlns:cx4="http://schemas.microsoft.com/office/drawing/2016/5/10/chartex" xmlns:cx5="http://schemas.microsoft.com/office/drawing/2016/5/11/chartex" xmlns:cx6="http://schemas.microsoft.com/office/drawing/2016/5/12/chartex" xmlns:cx7="http://schemas.microsoft.com/office/drawing/2016/5/13/chartex" xmlns:cx8="http://schemas.microsoft.com/office/drawing/2016/5/14/chartex" xmlns:mc="http://schemas.openxmlformats.org/markup-compatibility/2006" xmlns:aink="http://schemas.microsoft.com/office/drawing/2016/ink" xmlns:am3d="http://schemas.microsoft.com/office/drawing/2017/model3d" xmlns:o="urn:schemas-microsoft-com:office:office" xmlns:r="http://schemas.openxmlformats.org/officeDocument/2006/relationships" xmlns:m="http://schemas.openxmlformats.org/officeDocument/2006/math" xmlns:v="urn:schemas-microsoft-com:vml" xmlns:wp14="http://schemas.microsoft.com/office/word/2010/wordprocessingDrawing" xmlns:wp="http://schemas.openxmlformats.org/drawingml/2006/wordprocessingDrawing" xmlns:w10="urn:schemas-microsoft-com:office:word" xmlns:w="http://schemas.openxmlformats.org/wordprocessingml/2006/main" xmlns:w14="http://schemas.microsoft.com/office/word/2010/wordml" xmlns:w15="http://schemas.microsoft.com/office/word/2012/wordml" xmlns:w16cex="http://schemas.microsoft.com/office/word/2018/wordml/cex" xmlns:w16cid="http://schemas.microsoft.com/office/word/2016/wordml/cid" xmlns:w16="http://schemas.microsoft.com/office/word/2018/wordml" xmlns:w16sdtdh="http://schemas.microsoft.com/office/word/2020/wordml/sdtdatahash" xmlns:w16se="http://schemas.microsoft.com/office/word/2015/wordml/symex" xmlns:wpg="http://schemas.microsoft.com/office/word/2010/wordprocessingGroup" xmlns:wpi="http://schemas.microsoft.com/office/word/2010/wordprocessingInk" xmlns:wne="http://schemas.microsoft.com/office/word/2006/wordml" xmlns:wps="http://schemas.microsoft.com/office/word/2010/wordprocessingShape" mc:Ignorable="w14 w15 w16se w16cid w16 w16cex w16sdtdh wp14">
   <w:abstractNum w:abstractNumId="0" w15:restartNumberingAfterBreak="0">
-    <w:nsid w:val="260D6B32"/>
+    <w:nsid w:val="254E6346"/>
     <w:multiLevelType w:val="hybridMultilevel"/>
-    <w:tmpl w:val="3F5E8DCE"/>
-    <w:lvl w:ilvl="0" w:tplc="89BA17C6">
+    <w:tmpl w:val="88303FB8"/>
+    <w:lvl w:ilvl="0" w:tplc="E80A462C">
       <w:start w:val="1"/>
       <w:numFmt w:val="decimal"/>
       <w:lvlText w:val="%1."/>
@@ -1642,7 +1591,7 @@
         <w:lang w:val="es-ES" w:eastAsia="en-US" w:bidi="ar-SA"/>
       </w:rPr>
     </w:lvl>
-    <w:lvl w:ilvl="1" w:tplc="8F342DE8">
+    <w:lvl w:ilvl="1" w:tplc="629EE296">
       <w:numFmt w:val="bullet"/>
       <w:lvlText w:val="•"/>
       <w:lvlJc w:val="left"/>
@@ -1654,7 +1603,7 @@
         <w:lang w:val="es-ES" w:eastAsia="en-US" w:bidi="ar-SA"/>
       </w:rPr>
     </w:lvl>
-    <w:lvl w:ilvl="2" w:tplc="99ACDCA2">
+    <w:lvl w:ilvl="2" w:tplc="28F24BD0">
       <w:numFmt w:val="bullet"/>
       <w:lvlText w:val="•"/>
       <w:lvlJc w:val="left"/>
@@ -1666,7 +1615,7 @@
         <w:lang w:val="es-ES" w:eastAsia="en-US" w:bidi="ar-SA"/>
       </w:rPr>
     </w:lvl>
-    <w:lvl w:ilvl="3" w:tplc="DD8859AA">
+    <w:lvl w:ilvl="3" w:tplc="BC186712">
       <w:numFmt w:val="bullet"/>
       <w:lvlText w:val="•"/>
       <w:lvlJc w:val="left"/>
@@ -1678,7 +1627,7 @@
         <w:lang w:val="es-ES" w:eastAsia="en-US" w:bidi="ar-SA"/>
       </w:rPr>
     </w:lvl>
-    <w:lvl w:ilvl="4" w:tplc="3B64D35E">
+    <w:lvl w:ilvl="4" w:tplc="B798D08A">
       <w:numFmt w:val="bullet"/>
       <w:lvlText w:val="•"/>
       <w:lvlJc w:val="left"/>
@@ -1690,7 +1639,7 @@
         <w:lang w:val="es-ES" w:eastAsia="en-US" w:bidi="ar-SA"/>
       </w:rPr>
     </w:lvl>
-    <w:lvl w:ilvl="5" w:tplc="698ECA26">
+    <w:lvl w:ilvl="5" w:tplc="DD44278E">
       <w:numFmt w:val="bullet"/>
       <w:lvlText w:val="•"/>
       <w:lvlJc w:val="left"/>
@@ -1702,7 +1651,7 @@
         <w:lang w:val="es-ES" w:eastAsia="en-US" w:bidi="ar-SA"/>
       </w:rPr>
     </w:lvl>
-    <w:lvl w:ilvl="6" w:tplc="A81CD916">
+    <w:lvl w:ilvl="6" w:tplc="D0087942">
       <w:numFmt w:val="bullet"/>
       <w:lvlText w:val="•"/>
       <w:lvlJc w:val="left"/>
@@ -1714,7 +1663,7 @@
         <w:lang w:val="es-ES" w:eastAsia="en-US" w:bidi="ar-SA"/>
       </w:rPr>
     </w:lvl>
-    <w:lvl w:ilvl="7" w:tplc="B36A7C44">
+    <w:lvl w:ilvl="7" w:tplc="64A460B8">
       <w:numFmt w:val="bullet"/>
       <w:lvlText w:val="•"/>
       <w:lvlJc w:val="left"/>
@@ -1726,7 +1675,7 @@
         <w:lang w:val="es-ES" w:eastAsia="en-US" w:bidi="ar-SA"/>
       </w:rPr>
     </w:lvl>
-    <w:lvl w:ilvl="8" w:tplc="CE401686">
+    <w:lvl w:ilvl="8" w:tplc="092657B4">
       <w:numFmt w:val="bullet"/>
       <w:lvlText w:val="•"/>
       <w:lvlJc w:val="left"/>
@@ -1739,14 +1688,14 @@
       </w:rPr>
     </w:lvl>
   </w:abstractNum>
-  <w:num w:numId="1" w16cid:durableId="1320424650">
+  <w:num w:numId="1">
     <w:abstractNumId w:val="0"/>
   </w:num>
 </w:numbering>
 </file>
 
 <file path=word/styles.xml><?xml version="1.0" encoding="utf-8"?>
-<w:styles xmlns:mc="http://schemas.openxmlformats.org/markup-compatibility/2006" xmlns:r="http://schemas.openxmlformats.org/officeDocument/2006/relationships" xmlns:w="http://schemas.openxmlformats.org/wordprocessingml/2006/main" xmlns:w14="http://schemas.microsoft.com/office/word/2010/wordml" xmlns:w15="http://schemas.microsoft.com/office/word/2012/wordml" xmlns:w16cex="http://schemas.microsoft.com/office/word/2018/wordml/cex" xmlns:w16cid="http://schemas.microsoft.com/office/word/2016/wordml/cid" xmlns:w16="http://schemas.microsoft.com/office/word/2018/wordml" xmlns:w16du="http://schemas.microsoft.com/office/word/2023/wordml/word16du" xmlns:w16sdtdh="http://schemas.microsoft.com/office/word/2020/wordml/sdtdatahash" xmlns:w16se="http://schemas.microsoft.com/office/word/2015/wordml/symex" mc:Ignorable="w14 w15 w16se w16cid w16 w16cex w16sdtdh w16du">
+<w:styles xmlns:mc="http://schemas.openxmlformats.org/markup-compatibility/2006" xmlns:r="http://schemas.openxmlformats.org/officeDocument/2006/relationships" xmlns:w="http://schemas.openxmlformats.org/wordprocessingml/2006/main" xmlns:w14="http://schemas.microsoft.com/office/word/2010/wordml" xmlns:w15="http://schemas.microsoft.com/office/word/2012/wordml" xmlns:w16cex="http://schemas.microsoft.com/office/word/2018/wordml/cex" xmlns:w16cid="http://schemas.microsoft.com/office/word/2016/wordml/cid" xmlns:w16="http://schemas.microsoft.com/office/word/2018/wordml" xmlns:w16sdtdh="http://schemas.microsoft.com/office/word/2020/wordml/sdtdatahash" xmlns:w16se="http://schemas.microsoft.com/office/word/2015/wordml/symex" mc:Ignorable="w14 w15 w16se w16cid w16 w16cex w16sdtdh">
   <w:docDefaults>
     <w:rPrDefault>
       <w:rPr>

</xml_diff>